<commit_message>
Update bill files with website link
</commit_message>
<xml_diff>
--- a/downloads/bill.docx
+++ b/downloads/bill.docx
@@ -72,8 +72,19 @@
           <w:color w:val="000000"/>
           <w:sz w:val="22"/>
         </w:rPr>
-        <w:t>Representative Keshu Yang    |    H.R. 2035    |    Website: https://yangkeshu.github.io/fuel-smart-america-act/</w:t>
-      </w:r>
+        <w:t xml:space="preserve">Representative Keshu Yang    |    H.R. 2035    |    Website: </w:t>
+      </w:r>
+      <w:hyperlink r:id="rId7">
+        <w:r>
+          <w:rPr>
+            <w:rFonts w:ascii="Arial" w:hAnsi="Arial"/>
+            <w:sz w:val="22"/>
+            <w:color w:val="0563C1"/>
+            <w:u w:val="single"/>
+          </w:rPr>
+          <w:t>https://yangkeshu.github.io/fuel-smart-america-act/</w:t>
+        </w:r>
+      </w:hyperlink>
     </w:p>
     <w:p>
       <w:pPr>

</xml_diff>